<commit_message>
Tighten table-only price guidance
</commit_message>
<xml_diff>
--- a/applications/2026/Q2/实验室电子元器件采集/申报书.docx
+++ b/applications/2026/Q2/实验室电子元器件采集/申报书.docx
@@ -31,9 +31,8 @@
       <w:r>
         <w:rPr>
           <w:rFonts w:ascii="Times New Roman" w:hAnsi="Times New Roman" w:eastAsia="宋体"/>
-          <w:b w:val="0"/>
         </w:rPr>
-        <w:t>本次拟申报实验室电子元器件采购，重点服务 12 导联心电采集板样机，同时补充 4G LPDDR4X FBGA200 内存颗粒用于开发板、FPGA 板卡和 Linux 边缘计算板的内存颗粒验证。立创商城购物车 76 项合计 792.70 元，淘宝桌面版记录 LPDDR4X 颗粒 55.00 元，总计 847.70 元。该归类将可消耗、可入库、可用于多项目的电子元器件集中管理，BGA200 植锡台则单独作为返修工具申报。完整 76 项立创清单已放入本申报书最后的附件表，便于导师单文件审阅。</w:t>
+        <w:t>本次拟申报实验室电子元器件采购，重点服务 12 导联心电采集板样机，同时补充 4G LPDDR4X FBGA200 内存颗粒用于开发板、FPGA 板卡和 Linux 边缘计算板的内存颗粒验证。该归类将可消耗、可入库、可用于多项目的电子元器件集中管理，BGA200 植锡台则单独作为返修工具申报。经费明细和合计金额见下方经费表；完整 76 项立创清单已放入本申报书最后的附件表，便于导师单文件审阅。</w:t>
       </w:r>
     </w:p>
     <w:p>
@@ -11508,11 +11507,276 @@
       <w:r>
         <w:rPr>
           <w:rFonts w:ascii="Times New Roman" w:hAnsi="Times New Roman" w:eastAsia="宋体"/>
-          <w:b w:val="0"/>
         </w:rPr>
-        <w:t>附件合计：立创商城购物车 76 项，金额合计 792.70 元；另计 LPDDR4X 内存颗粒 55.00 元，本项目总额 847.70 元。</w:t>
+        <w:t>附件汇总如下：</w:t>
       </w:r>
     </w:p>
+    <w:tbl>
+      <w:tblPr>
+        <w:tblStyle w:val="TableGrid"/>
+        <w:tblW w:type="auto" w:w="0"/>
+        <w:tblLook w:firstColumn="1" w:firstRow="1" w:lastColumn="0" w:lastRow="0" w:noHBand="0" w:noVBand="1" w:val="04A0"/>
+      </w:tblPr>
+      <w:tblGrid>
+        <w:gridCol w:w="2160"/>
+        <w:gridCol w:w="2160"/>
+        <w:gridCol w:w="2160"/>
+        <w:gridCol w:w="2160"/>
+      </w:tblGrid>
+      <w:tr>
+        <w:tc>
+          <w:tcPr>
+            <w:tcW w:type="dxa" w:w="2160"/>
+          </w:tcPr>
+          <w:p>
+            <w:r>
+              <w:rPr>
+                <w:rFonts w:ascii="Times New Roman" w:hAnsi="Times New Roman" w:eastAsia="黑体"/>
+                <w:b/>
+                <w:sz w:val="16"/>
+              </w:rPr>
+              <w:t>项目</w:t>
+            </w:r>
+          </w:p>
+        </w:tc>
+        <w:tc>
+          <w:tcPr>
+            <w:tcW w:type="dxa" w:w="2160"/>
+          </w:tcPr>
+          <w:p>
+            <w:r>
+              <w:rPr>
+                <w:rFonts w:ascii="Times New Roman" w:hAnsi="Times New Roman" w:eastAsia="黑体"/>
+                <w:b/>
+                <w:sz w:val="16"/>
+              </w:rPr>
+              <w:t>数量</w:t>
+            </w:r>
+          </w:p>
+        </w:tc>
+        <w:tc>
+          <w:tcPr>
+            <w:tcW w:type="dxa" w:w="2160"/>
+          </w:tcPr>
+          <w:p>
+            <w:r>
+              <w:rPr>
+                <w:rFonts w:ascii="Times New Roman" w:hAnsi="Times New Roman" w:eastAsia="黑体"/>
+                <w:b/>
+                <w:sz w:val="16"/>
+              </w:rPr>
+              <w:t>小计(CNY)</w:t>
+            </w:r>
+          </w:p>
+        </w:tc>
+        <w:tc>
+          <w:tcPr>
+            <w:tcW w:type="dxa" w:w="2160"/>
+          </w:tcPr>
+          <w:p>
+            <w:r>
+              <w:rPr>
+                <w:rFonts w:ascii="Times New Roman" w:hAnsi="Times New Roman" w:eastAsia="黑体"/>
+                <w:b/>
+                <w:sz w:val="16"/>
+              </w:rPr>
+              <w:t>说明</w:t>
+            </w:r>
+          </w:p>
+        </w:tc>
+      </w:tr>
+      <w:tr>
+        <w:tc>
+          <w:tcPr>
+            <w:tcW w:type="dxa" w:w="2160"/>
+          </w:tcPr>
+          <w:p>
+            <w:r>
+              <w:rPr>
+                <w:rFonts w:ascii="Times New Roman" w:hAnsi="Times New Roman" w:eastAsia="宋体"/>
+                <w:sz w:val="16"/>
+              </w:rPr>
+              <w:t>立创商城购物车明细</w:t>
+            </w:r>
+          </w:p>
+        </w:tc>
+        <w:tc>
+          <w:tcPr>
+            <w:tcW w:type="dxa" w:w="2160"/>
+          </w:tcPr>
+          <w:p>
+            <w:pPr>
+              <w:jc w:val="center"/>
+            </w:pPr>
+            <w:r>
+              <w:rPr>
+                <w:rFonts w:ascii="Times New Roman" w:hAnsi="Times New Roman" w:eastAsia="宋体"/>
+                <w:sz w:val="16"/>
+              </w:rPr>
+              <w:t>76项</w:t>
+            </w:r>
+          </w:p>
+        </w:tc>
+        <w:tc>
+          <w:tcPr>
+            <w:tcW w:type="dxa" w:w="2160"/>
+          </w:tcPr>
+          <w:p>
+            <w:pPr>
+              <w:jc w:val="center"/>
+            </w:pPr>
+            <w:r>
+              <w:rPr>
+                <w:rFonts w:ascii="Times New Roman" w:hAnsi="Times New Roman" w:eastAsia="宋体"/>
+                <w:sz w:val="16"/>
+              </w:rPr>
+              <w:t>792.70</w:t>
+            </w:r>
+          </w:p>
+        </w:tc>
+        <w:tc>
+          <w:tcPr>
+            <w:tcW w:type="dxa" w:w="2160"/>
+          </w:tcPr>
+          <w:p>
+            <w:r>
+              <w:rPr>
+                <w:rFonts w:ascii="Times New Roman" w:hAnsi="Times New Roman" w:eastAsia="宋体"/>
+                <w:sz w:val="16"/>
+              </w:rPr>
+              <w:t>完整明细见上表</w:t>
+            </w:r>
+          </w:p>
+        </w:tc>
+      </w:tr>
+      <w:tr>
+        <w:tc>
+          <w:tcPr>
+            <w:tcW w:type="dxa" w:w="2160"/>
+          </w:tcPr>
+          <w:p>
+            <w:r>
+              <w:rPr>
+                <w:rFonts w:ascii="Times New Roman" w:hAnsi="Times New Roman" w:eastAsia="宋体"/>
+                <w:sz w:val="16"/>
+              </w:rPr>
+              <w:t>MT53D1024M32D4DT-053WT:D 4G LPDDR4X 颗粒</w:t>
+            </w:r>
+          </w:p>
+        </w:tc>
+        <w:tc>
+          <w:tcPr>
+            <w:tcW w:type="dxa" w:w="2160"/>
+          </w:tcPr>
+          <w:p>
+            <w:pPr>
+              <w:jc w:val="center"/>
+            </w:pPr>
+            <w:r>
+              <w:rPr>
+                <w:rFonts w:ascii="Times New Roman" w:hAnsi="Times New Roman" w:eastAsia="宋体"/>
+                <w:sz w:val="16"/>
+              </w:rPr>
+              <w:t>1项</w:t>
+            </w:r>
+          </w:p>
+        </w:tc>
+        <w:tc>
+          <w:tcPr>
+            <w:tcW w:type="dxa" w:w="2160"/>
+          </w:tcPr>
+          <w:p>
+            <w:pPr>
+              <w:jc w:val="center"/>
+            </w:pPr>
+            <w:r>
+              <w:rPr>
+                <w:rFonts w:ascii="Times New Roman" w:hAnsi="Times New Roman" w:eastAsia="宋体"/>
+                <w:sz w:val="16"/>
+              </w:rPr>
+              <w:t>55.00</w:t>
+            </w:r>
+          </w:p>
+        </w:tc>
+        <w:tc>
+          <w:tcPr>
+            <w:tcW w:type="dxa" w:w="2160"/>
+          </w:tcPr>
+          <w:p>
+            <w:r>
+              <w:rPr>
+                <w:rFonts w:ascii="Times New Roman" w:hAnsi="Times New Roman" w:eastAsia="宋体"/>
+                <w:sz w:val="16"/>
+              </w:rPr>
+              <w:t>淘宝截图识别价格</w:t>
+            </w:r>
+          </w:p>
+        </w:tc>
+      </w:tr>
+      <w:tr>
+        <w:tc>
+          <w:tcPr>
+            <w:tcW w:type="dxa" w:w="2160"/>
+          </w:tcPr>
+          <w:p>
+            <w:r>
+              <w:rPr>
+                <w:rFonts w:ascii="Times New Roman" w:hAnsi="Times New Roman" w:eastAsia="宋体"/>
+                <w:sz w:val="16"/>
+              </w:rPr>
+              <w:t>合计</w:t>
+            </w:r>
+          </w:p>
+        </w:tc>
+        <w:tc>
+          <w:tcPr>
+            <w:tcW w:type="dxa" w:w="2160"/>
+          </w:tcPr>
+          <w:p>
+            <w:pPr>
+              <w:jc w:val="center"/>
+            </w:pPr>
+            <w:r>
+              <w:rPr>
+                <w:rFonts w:ascii="Times New Roman" w:hAnsi="Times New Roman" w:eastAsia="宋体"/>
+                <w:sz w:val="16"/>
+              </w:rPr>
+            </w:r>
+          </w:p>
+        </w:tc>
+        <w:tc>
+          <w:tcPr>
+            <w:tcW w:type="dxa" w:w="2160"/>
+          </w:tcPr>
+          <w:p>
+            <w:pPr>
+              <w:jc w:val="center"/>
+            </w:pPr>
+            <w:r>
+              <w:rPr>
+                <w:rFonts w:ascii="Times New Roman" w:hAnsi="Times New Roman" w:eastAsia="宋体"/>
+                <w:sz w:val="16"/>
+              </w:rPr>
+              <w:t>847.70</w:t>
+            </w:r>
+          </w:p>
+        </w:tc>
+        <w:tc>
+          <w:tcPr>
+            <w:tcW w:type="dxa" w:w="2160"/>
+          </w:tcPr>
+          <w:p>
+            <w:r>
+              <w:rPr>
+                <w:rFonts w:ascii="Times New Roman" w:hAnsi="Times New Roman" w:eastAsia="宋体"/>
+                <w:sz w:val="16"/>
+              </w:rPr>
+              <w:t>本项目预算合计</w:t>
+            </w:r>
+          </w:p>
+        </w:tc>
+      </w:tr>
+    </w:tbl>
     <w:sectPr>
       <w:pgSz w:w="12240" w:h="15840"/>
       <w:pgMar w:top="1440" w:right="1800" w:bottom="1440" w:left="1800" w:header="720" w:footer="720" w:gutter="0"/>

</xml_diff>

<commit_message>
Expand electronics component proposal
</commit_message>
<xml_diff>
--- a/applications/2026/Q2/实验室电子元器件采集/申报书.docx
+++ b/applications/2026/Q2/实验室电子元器件采集/申报书.docx
@@ -33,7 +33,7 @@
           <w:rFonts w:ascii="Times New Roman" w:hAnsi="Times New Roman" w:eastAsia="宋体"/>
           <w:b w:val="0"/>
         </w:rPr>
-        <w:t>12 导联心电采集板样机需要完整、可复现的电子元器件储备，用于焊接、上电调试、模拟前端验证和后续版本迭代。当前实验室还需要补充 LPDDR4X 内存颗粒，用于开发板、FPGA 板卡和 Linux 边缘计算板的内存颗粒验证。将这些耗材归入同一元器件申报，便于采购、入库、复盘和后续 BOM 修订。</w:t>
+        <w:t>12 导联心电采集板、雷达板和自制控制板卡均需要稳定、可复现的电子元器件储备，用于样机焊接、上电调试、通信接口验证和后续版本迭代。现有实验室硬件工作同时涉及生物电模拟前端、雷达采集前端、嵌入式控制、人机交互显示和边缘计算终端扩展，因此需要将常用元器件、关键接口器件和板级升级器件集中采购、统一归档。</w:t>
       </w:r>
     </w:p>
     <w:p>
@@ -54,7 +54,7 @@
           <w:rFonts w:ascii="Times New Roman" w:hAnsi="Times New Roman" w:eastAsia="宋体"/>
           <w:b w:val="0"/>
         </w:rPr>
-        <w:t>本次采购用于支撑 12 导联心电采集板样机制作，并为实验室嵌入式/FPGA/边缘计算平台提供通用电子器件储备。ADS1298R 用于多导联生物电采集，T113-S3、NAND Flash、ESP32、连接器、电源和保护器件用于完成采集、控制、供电、通信与数据缓存闭环，LPDDR4X 颗粒用于内存替换与兼容性学习。</w:t>
+        <w:t>本次采购用于支撑 12 导联心电采集板、雷达板、自制控制板卡和常用元器件补充。立创购物车元器件用于生物电采集、电源管理、保护、连接、存储和控制链路；LPDDR4X FBGA200 内存颗粒用于 Radxa Cubie A5E 从 1GB 升级到 4GB 的板级验证；RTL8723DS 模块用于自制控制板卡和小型采集节点的 WiFi/蓝牙通信接口；6.9 寸 MIPI 触摸显示屏用于便携式控制面板、雷达板调试界面和样机状态显示。</w:t>
       </w:r>
     </w:p>
     <w:p>
@@ -77,7 +77,7 @@
         <w:rPr>
           <w:rFonts w:ascii="Times New Roman" w:hAnsi="Times New Roman" w:eastAsia="宋体"/>
         </w:rPr>
-        <w:t>完成 12 导联心电采集板核心元器件备料，并保证关键器件型号、数量和价格可追溯。</w:t>
+        <w:t>形成覆盖 12 导联采集板、雷达板和自制控制板卡的常用元器件储备，保证关键器件型号、数量和价格可追溯。</w:t>
       </w:r>
     </w:p>
     <w:p>
@@ -88,7 +88,7 @@
         <w:rPr>
           <w:rFonts w:ascii="Times New Roman" w:hAnsi="Times New Roman" w:eastAsia="宋体"/>
         </w:rPr>
-        <w:t>完成至少一块 12 导联采集板样机或关键模块的焊接与上电调试。</w:t>
+        <w:t>完成至少一块 12 导联心电采集板、雷达板或自制控制板卡样机的焊接、上电和关键模块调试。</w:t>
       </w:r>
     </w:p>
     <w:p>
@@ -99,7 +99,7 @@
         <w:rPr>
           <w:rFonts w:ascii="Times New Roman" w:hAnsi="Times New Roman" w:eastAsia="宋体"/>
         </w:rPr>
-        <w:t>完成 ADS1298R 生物电模拟前端基础采样验证，记录噪声、导联连接和保护电路问题。</w:t>
+        <w:t>完成 A5E 由 1GB 向 4GB 内存扩展的板级验证准备，支撑双网口边缘采集终端容量扩展。</w:t>
       </w:r>
     </w:p>
     <w:p>
@@ -110,7 +110,7 @@
         <w:rPr>
           <w:rFonts w:ascii="Times New Roman" w:hAnsi="Times New Roman" w:eastAsia="宋体"/>
         </w:rPr>
-        <w:t>建立 LPDDR4X FBGA200 内存颗粒的入库和后续验证记录，为开发板/FPGA 板卡返修学习提供耗材基础。</w:t>
+        <w:t>完成无线通信模块和 MIPI 触摸显示屏的接口验证准备，支撑控制板卡通信、人机交互和样机状态显示。</w:t>
       </w:r>
     </w:p>
     <w:p>
@@ -370,8 +370,9 @@
             <w:r>
               <w:rPr>
                 <w:rFonts w:ascii="Times New Roman" w:hAnsi="Times New Roman" w:eastAsia="宋体"/>
-              </w:rPr>
-              <w:t>当前记录价，FBGA200 封装</w:t>
+                <w:sz w:val="16"/>
+              </w:rPr>
+              <w:t>用于 A5E 升级到 4GB 的板级验证</w:t>
             </w:r>
           </w:p>
         </w:tc>
@@ -387,6 +388,168 @@
                 <w:rFonts w:ascii="Times New Roman" w:hAnsi="Times New Roman" w:eastAsia="宋体"/>
                 <w:sz w:val="16"/>
               </w:rPr>
+              <w:t>RTL8723DS WiFi/BT 模块</w:t>
+            </w:r>
+          </w:p>
+        </w:tc>
+        <w:tc>
+          <w:tcPr>
+            <w:tcW w:type="dxa" w:w="1728"/>
+          </w:tcPr>
+          <w:p>
+            <w:pPr>
+              <w:jc w:val="center"/>
+            </w:pPr>
+            <w:r>
+              <w:rPr>
+                <w:rFonts w:ascii="Times New Roman" w:hAnsi="Times New Roman" w:eastAsia="宋体"/>
+                <w:sz w:val="16"/>
+              </w:rPr>
+              <w:t>1</w:t>
+            </w:r>
+          </w:p>
+        </w:tc>
+        <w:tc>
+          <w:tcPr>
+            <w:tcW w:type="dxa" w:w="1728"/>
+          </w:tcPr>
+          <w:p>
+            <w:pPr>
+              <w:jc w:val="center"/>
+            </w:pPr>
+            <w:r>
+              <w:rPr>
+                <w:rFonts w:ascii="Times New Roman" w:hAnsi="Times New Roman" w:eastAsia="宋体"/>
+                <w:sz w:val="16"/>
+              </w:rPr>
+              <w:t>7.91</w:t>
+            </w:r>
+          </w:p>
+        </w:tc>
+        <w:tc>
+          <w:tcPr>
+            <w:tcW w:type="dxa" w:w="1728"/>
+          </w:tcPr>
+          <w:p>
+            <w:pPr>
+              <w:jc w:val="center"/>
+            </w:pPr>
+            <w:r>
+              <w:rPr>
+                <w:rFonts w:ascii="Times New Roman" w:hAnsi="Times New Roman" w:eastAsia="宋体"/>
+                <w:sz w:val="16"/>
+              </w:rPr>
+              <w:t>7.91</w:t>
+            </w:r>
+          </w:p>
+        </w:tc>
+        <w:tc>
+          <w:tcPr>
+            <w:tcW w:type="dxa" w:w="1728"/>
+          </w:tcPr>
+          <w:p>
+            <w:r>
+              <w:rPr>
+                <w:rFonts w:ascii="Times New Roman" w:hAnsi="Times New Roman" w:eastAsia="宋体"/>
+                <w:sz w:val="16"/>
+              </w:rPr>
+              <w:t>用于自制控制板卡和小型采集节点通信接口</w:t>
+            </w:r>
+          </w:p>
+        </w:tc>
+      </w:tr>
+      <w:tr>
+        <w:tc>
+          <w:tcPr>
+            <w:tcW w:type="dxa" w:w="1728"/>
+          </w:tcPr>
+          <w:p>
+            <w:r>
+              <w:rPr>
+                <w:rFonts w:ascii="Times New Roman" w:hAnsi="Times New Roman" w:eastAsia="宋体"/>
+                <w:sz w:val="16"/>
+              </w:rPr>
+              <w:t>6.9 寸 280x1424 MIPI 触摸显示屏</w:t>
+            </w:r>
+          </w:p>
+        </w:tc>
+        <w:tc>
+          <w:tcPr>
+            <w:tcW w:type="dxa" w:w="1728"/>
+          </w:tcPr>
+          <w:p>
+            <w:pPr>
+              <w:jc w:val="center"/>
+            </w:pPr>
+            <w:r>
+              <w:rPr>
+                <w:rFonts w:ascii="Times New Roman" w:hAnsi="Times New Roman" w:eastAsia="宋体"/>
+                <w:sz w:val="16"/>
+              </w:rPr>
+              <w:t>1</w:t>
+            </w:r>
+          </w:p>
+        </w:tc>
+        <w:tc>
+          <w:tcPr>
+            <w:tcW w:type="dxa" w:w="1728"/>
+          </w:tcPr>
+          <w:p>
+            <w:pPr>
+              <w:jc w:val="center"/>
+            </w:pPr>
+            <w:r>
+              <w:rPr>
+                <w:rFonts w:ascii="Times New Roman" w:hAnsi="Times New Roman" w:eastAsia="宋体"/>
+                <w:sz w:val="16"/>
+              </w:rPr>
+              <w:t>131.50</w:t>
+            </w:r>
+          </w:p>
+        </w:tc>
+        <w:tc>
+          <w:tcPr>
+            <w:tcW w:type="dxa" w:w="1728"/>
+          </w:tcPr>
+          <w:p>
+            <w:pPr>
+              <w:jc w:val="center"/>
+            </w:pPr>
+            <w:r>
+              <w:rPr>
+                <w:rFonts w:ascii="Times New Roman" w:hAnsi="Times New Roman" w:eastAsia="宋体"/>
+                <w:sz w:val="16"/>
+              </w:rPr>
+              <w:t>131.50</w:t>
+            </w:r>
+          </w:p>
+        </w:tc>
+        <w:tc>
+          <w:tcPr>
+            <w:tcW w:type="dxa" w:w="1728"/>
+          </w:tcPr>
+          <w:p>
+            <w:r>
+              <w:rPr>
+                <w:rFonts w:ascii="Times New Roman" w:hAnsi="Times New Roman" w:eastAsia="宋体"/>
+                <w:sz w:val="16"/>
+              </w:rPr>
+              <w:t>用于便携式控制面板、雷达板调试界面和样机状态显示</w:t>
+            </w:r>
+          </w:p>
+        </w:tc>
+      </w:tr>
+      <w:tr>
+        <w:tc>
+          <w:tcPr>
+            <w:tcW w:type="dxa" w:w="1728"/>
+          </w:tcPr>
+          <w:p>
+            <w:r>
+              <w:rPr>
+                <w:rFonts w:ascii="Times New Roman" w:hAnsi="Times New Roman" w:eastAsia="宋体"/>
+                <w:sz w:val="16"/>
+              </w:rPr>
               <w:t>合计</w:t>
             </w:r>
           </w:p>
@@ -436,7 +599,7 @@
                 <w:rFonts w:ascii="Times New Roman" w:hAnsi="Times New Roman" w:eastAsia="宋体"/>
                 <w:sz w:val="16"/>
               </w:rPr>
-              <w:t>847.70</w:t>
+              <w:t>987.11</w:t>
             </w:r>
           </w:p>
         </w:tc>
@@ -448,6 +611,7 @@
             <w:r>
               <w:rPr>
                 <w:rFonts w:ascii="Times New Roman" w:hAnsi="Times New Roman" w:eastAsia="宋体"/>
+                <w:sz w:val="16"/>
               </w:rPr>
               <w:t>实际以审批后订单及发票为准</w:t>
             </w:r>
@@ -475,7 +639,7 @@
         <w:rPr>
           <w:rFonts w:ascii="Times New Roman" w:hAnsi="Times New Roman" w:eastAsia="宋体"/>
         </w:rPr>
-        <w:t>形成一套 12 导联心电采集板样机所需电子元器件清单和实物储备，支撑后续样机制作。</w:t>
+        <w:t>形成实验室可复用的电子元器件储备，支撑 12 导联采集板、雷达板和自制控制板卡样机制作。</w:t>
       </w:r>
     </w:p>
     <w:p>
@@ -486,7 +650,7 @@
         <w:rPr>
           <w:rFonts w:ascii="Times New Roman" w:hAnsi="Times New Roman" w:eastAsia="宋体"/>
         </w:rPr>
-        <w:t>形成关键器件焊接、上电和基础采样调试记录，为论文实验和后续样机迭代提供硬件基础。</w:t>
+        <w:t>形成 12 导联采集板关键器件焊接、上电和基础采样调试记录，为后续实验数据采集和论文工作提供硬件基础。</w:t>
       </w:r>
     </w:p>
     <w:p>
@@ -497,7 +661,7 @@
         <w:rPr>
           <w:rFonts w:ascii="Times New Roman" w:hAnsi="Times New Roman" w:eastAsia="宋体"/>
         </w:rPr>
-        <w:t>补充 LPDDR4X 内存颗粒耗材，支撑开发板、FPGA 板卡和 Linux 边缘计算板内存替换学习。</w:t>
+        <w:t>支撑 A5E 4GB 内存升级验证，为双网口边缘采集终端提供更高内存余量和系统扩展能力。</w:t>
       </w:r>
     </w:p>
     <w:p>
@@ -508,7 +672,7 @@
         <w:rPr>
           <w:rFonts w:ascii="Times New Roman" w:hAnsi="Times New Roman" w:eastAsia="宋体"/>
         </w:rPr>
-        <w:t>为实验室电子元器件采购、入库和申报复盘建立可追溯模板。</w:t>
+        <w:t>补齐无线通信和触摸显示类器件，支撑控制板卡、便携式实验终端和雷达板调试界面建设。</w:t>
       </w:r>
     </w:p>
     <w:p>
@@ -527,8 +691,9 @@
       <w:r>
         <w:rPr>
           <w:rFonts w:ascii="Times New Roman" w:hAnsi="Times New Roman" w:eastAsia="宋体"/>
+          <w:b w:val="0"/>
         </w:rPr>
-        <w:t>本次经费按当前记录价格测算，实际采购金额以审批后订单及发票为准。</w:t>
+        <w:t>本次经费按当前记录价格测算，实际采购金额以审批后订单及发票为准。所有元器件到货后按项目用途和器件类别入库，优先用于 12 导联心电采集板、雷达板、自制控制板卡和 A5E 内存扩展验证。</w:t>
       </w:r>
     </w:p>
     <w:p>
@@ -553,7 +718,7 @@
       <w:r>
         <w:drawing>
           <wp:inline xmlns:a="http://schemas.openxmlformats.org/drawingml/2006/main" xmlns:pic="http://schemas.openxmlformats.org/drawingml/2006/picture">
-            <wp:extent cx="5212080" cy="3192399"/>
+            <wp:extent cx="5166360" cy="3164395"/>
             <wp:docPr id="1" name="Picture 1"/>
             <wp:cNvGraphicFramePr>
               <a:graphicFrameLocks noChangeAspect="1"/>
@@ -574,7 +739,7 @@
                   <pic:spPr>
                     <a:xfrm>
                       <a:off x="0" y="0"/>
-                      <a:ext cx="5212080" cy="3192399"/>
+                      <a:ext cx="5166360" cy="3164395"/>
                     </a:xfrm>
                     <a:prstGeom prst="rect"/>
                   </pic:spPr>
@@ -598,7 +763,7 @@
       <w:r>
         <w:drawing>
           <wp:inline xmlns:a="http://schemas.openxmlformats.org/drawingml/2006/main" xmlns:pic="http://schemas.openxmlformats.org/drawingml/2006/picture">
-            <wp:extent cx="5212080" cy="2834068"/>
+            <wp:extent cx="5166360" cy="2809208"/>
             <wp:docPr id="2" name="Picture 2"/>
             <wp:cNvGraphicFramePr>
               <a:graphicFrameLocks noChangeAspect="1"/>
@@ -619,7 +784,97 @@
                   <pic:spPr>
                     <a:xfrm>
                       <a:off x="0" y="0"/>
-                      <a:ext cx="5212080" cy="2834068"/>
+                      <a:ext cx="5166360" cy="2809208"/>
+                    </a:xfrm>
+                    <a:prstGeom prst="rect"/>
+                  </pic:spPr>
+                </pic:pic>
+              </a:graphicData>
+            </a:graphic>
+          </wp:inline>
+        </w:drawing>
+      </w:r>
+    </w:p>
+    <w:p>
+      <w:r>
+        <w:rPr>
+          <w:rFonts w:ascii="Times New Roman" w:hAnsi="Times New Roman" w:eastAsia="宋体"/>
+          <w:b w:val="0"/>
+        </w:rPr>
+        <w:t>RTL8723DS WiFi/BT 模块价格截图</w:t>
+      </w:r>
+    </w:p>
+    <w:p>
+      <w:r>
+        <w:drawing>
+          <wp:inline xmlns:a="http://schemas.openxmlformats.org/drawingml/2006/main" xmlns:pic="http://schemas.openxmlformats.org/drawingml/2006/picture">
+            <wp:extent cx="5166360" cy="2647962"/>
+            <wp:docPr id="3" name="Picture 3"/>
+            <wp:cNvGraphicFramePr>
+              <a:graphicFrameLocks noChangeAspect="1"/>
+            </wp:cNvGraphicFramePr>
+            <a:graphic>
+              <a:graphicData uri="http://schemas.openxmlformats.org/drawingml/2006/picture">
+                <pic:pic>
+                  <pic:nvPicPr>
+                    <pic:cNvPr id="0" name="taobao-rtl8723ds-wifi-bt.png"/>
+                    <pic:cNvPicPr/>
+                  </pic:nvPicPr>
+                  <pic:blipFill>
+                    <a:blip r:embed="rId11"/>
+                    <a:stretch>
+                      <a:fillRect/>
+                    </a:stretch>
+                  </pic:blipFill>
+                  <pic:spPr>
+                    <a:xfrm>
+                      <a:off x="0" y="0"/>
+                      <a:ext cx="5166360" cy="2647962"/>
+                    </a:xfrm>
+                    <a:prstGeom prst="rect"/>
+                  </pic:spPr>
+                </pic:pic>
+              </a:graphicData>
+            </a:graphic>
+          </wp:inline>
+        </w:drawing>
+      </w:r>
+    </w:p>
+    <w:p>
+      <w:r>
+        <w:rPr>
+          <w:rFonts w:ascii="Times New Roman" w:hAnsi="Times New Roman" w:eastAsia="宋体"/>
+          <w:b w:val="0"/>
+        </w:rPr>
+        <w:t>6.9 寸 MIPI 触摸显示屏价格截图</w:t>
+      </w:r>
+    </w:p>
+    <w:p>
+      <w:r>
+        <w:drawing>
+          <wp:inline xmlns:a="http://schemas.openxmlformats.org/drawingml/2006/main" xmlns:pic="http://schemas.openxmlformats.org/drawingml/2006/picture">
+            <wp:extent cx="5166360" cy="2647962"/>
+            <wp:docPr id="4" name="Picture 4"/>
+            <wp:cNvGraphicFramePr>
+              <a:graphicFrameLocks noChangeAspect="1"/>
+            </wp:cNvGraphicFramePr>
+            <a:graphic>
+              <a:graphicData uri="http://schemas.openxmlformats.org/drawingml/2006/picture">
+                <pic:pic>
+                  <pic:nvPicPr>
+                    <pic:cNvPr id="0" name="taobao-6p9-mipi-display.png"/>
+                    <pic:cNvPicPr/>
+                  </pic:nvPicPr>
+                  <pic:blipFill>
+                    <a:blip r:embed="rId12"/>
+                    <a:stretch>
+                      <a:fillRect/>
+                    </a:stretch>
+                  </pic:blipFill>
+                  <pic:spPr>
+                    <a:xfrm>
+                      <a:off x="0" y="0"/>
+                      <a:ext cx="5166360" cy="2647962"/>
                     </a:xfrm>
                     <a:prstGeom prst="rect"/>
                   </pic:spPr>
@@ -12328,8 +12583,9 @@
             <w:r>
               <w:rPr>
                 <w:rFonts w:ascii="Times New Roman" w:hAnsi="Times New Roman" w:eastAsia="宋体"/>
-              </w:rPr>
-              <w:t>当前记录价</w:t>
+                <w:sz w:val="16"/>
+              </w:rPr>
+              <w:t>用于 A5E 升级到 4GB 的板级验证</w:t>
             </w:r>
           </w:p>
         </w:tc>
@@ -12345,6 +12601,140 @@
                 <w:rFonts w:ascii="Times New Roman" w:hAnsi="Times New Roman" w:eastAsia="宋体"/>
                 <w:sz w:val="16"/>
               </w:rPr>
+              <w:t>RTL8723DS WiFi/BT 模块</w:t>
+            </w:r>
+          </w:p>
+        </w:tc>
+        <w:tc>
+          <w:tcPr>
+            <w:tcW w:type="dxa" w:w="2160"/>
+          </w:tcPr>
+          <w:p>
+            <w:pPr>
+              <w:jc w:val="center"/>
+            </w:pPr>
+            <w:r>
+              <w:rPr>
+                <w:rFonts w:ascii="Times New Roman" w:hAnsi="Times New Roman" w:eastAsia="宋体"/>
+                <w:sz w:val="16"/>
+              </w:rPr>
+              <w:t>1项</w:t>
+            </w:r>
+          </w:p>
+        </w:tc>
+        <w:tc>
+          <w:tcPr>
+            <w:tcW w:type="dxa" w:w="2160"/>
+          </w:tcPr>
+          <w:p>
+            <w:pPr>
+              <w:jc w:val="center"/>
+            </w:pPr>
+            <w:r>
+              <w:rPr>
+                <w:rFonts w:ascii="Times New Roman" w:hAnsi="Times New Roman" w:eastAsia="宋体"/>
+                <w:sz w:val="16"/>
+              </w:rPr>
+              <w:t>7.91</w:t>
+            </w:r>
+          </w:p>
+        </w:tc>
+        <w:tc>
+          <w:tcPr>
+            <w:tcW w:type="dxa" w:w="2160"/>
+          </w:tcPr>
+          <w:p>
+            <w:pPr>
+              <w:jc w:val="center"/>
+            </w:pPr>
+            <w:r>
+              <w:rPr>
+                <w:rFonts w:ascii="Times New Roman" w:hAnsi="Times New Roman" w:eastAsia="宋体"/>
+                <w:sz w:val="16"/>
+              </w:rPr>
+              <w:t>用于自制控制板卡和小型采集节点通信接口</w:t>
+            </w:r>
+          </w:p>
+        </w:tc>
+      </w:tr>
+      <w:tr>
+        <w:tc>
+          <w:tcPr>
+            <w:tcW w:type="dxa" w:w="2160"/>
+          </w:tcPr>
+          <w:p>
+            <w:r>
+              <w:rPr>
+                <w:rFonts w:ascii="Times New Roman" w:hAnsi="Times New Roman" w:eastAsia="宋体"/>
+                <w:sz w:val="16"/>
+              </w:rPr>
+              <w:t>6.9 寸 280x1424 MIPI 触摸显示屏</w:t>
+            </w:r>
+          </w:p>
+        </w:tc>
+        <w:tc>
+          <w:tcPr>
+            <w:tcW w:type="dxa" w:w="2160"/>
+          </w:tcPr>
+          <w:p>
+            <w:pPr>
+              <w:jc w:val="center"/>
+            </w:pPr>
+            <w:r>
+              <w:rPr>
+                <w:rFonts w:ascii="Times New Roman" w:hAnsi="Times New Roman" w:eastAsia="宋体"/>
+                <w:sz w:val="16"/>
+              </w:rPr>
+              <w:t>1项</w:t>
+            </w:r>
+          </w:p>
+        </w:tc>
+        <w:tc>
+          <w:tcPr>
+            <w:tcW w:type="dxa" w:w="2160"/>
+          </w:tcPr>
+          <w:p>
+            <w:pPr>
+              <w:jc w:val="center"/>
+            </w:pPr>
+            <w:r>
+              <w:rPr>
+                <w:rFonts w:ascii="Times New Roman" w:hAnsi="Times New Roman" w:eastAsia="宋体"/>
+                <w:sz w:val="16"/>
+              </w:rPr>
+              <w:t>131.50</w:t>
+            </w:r>
+          </w:p>
+        </w:tc>
+        <w:tc>
+          <w:tcPr>
+            <w:tcW w:type="dxa" w:w="2160"/>
+          </w:tcPr>
+          <w:p>
+            <w:pPr>
+              <w:jc w:val="center"/>
+            </w:pPr>
+            <w:r>
+              <w:rPr>
+                <w:rFonts w:ascii="Times New Roman" w:hAnsi="Times New Roman" w:eastAsia="宋体"/>
+                <w:sz w:val="16"/>
+              </w:rPr>
+              <w:t>用于便携式控制面板和样机状态显示</w:t>
+            </w:r>
+          </w:p>
+        </w:tc>
+      </w:tr>
+      <w:tr>
+        <w:tc>
+          <w:tcPr>
+            <w:tcW w:type="dxa" w:w="2160"/>
+          </w:tcPr>
+          <w:p>
+            <w:r>
+              <w:rPr>
+                <w:rFonts w:ascii="Times New Roman" w:hAnsi="Times New Roman" w:eastAsia="宋体"/>
+                <w:sz w:val="16"/>
+              </w:rPr>
               <w:t>合计</w:t>
             </w:r>
           </w:p>
@@ -12378,7 +12768,7 @@
                 <w:rFonts w:ascii="Times New Roman" w:hAnsi="Times New Roman" w:eastAsia="宋体"/>
                 <w:sz w:val="16"/>
               </w:rPr>
-              <w:t>847.70</w:t>
+              <w:t>987.11</w:t>
             </w:r>
           </w:p>
         </w:tc>

</xml_diff>

<commit_message>
Simplify electronics budget table
</commit_message>
<xml_diff>
--- a/applications/2026/Q2/实验室电子元器件采集/申报书.docx
+++ b/applications/2026/Q2/实验室电子元器件采集/申报书.docx
@@ -88,7 +88,7 @@
         <w:rPr>
           <w:rFonts w:ascii="Times New Roman" w:hAnsi="Times New Roman" w:eastAsia="宋体"/>
         </w:rPr>
-        <w:t>完成至少一块 12 导联心电采集板、雷达板或自制控制板卡样机的焊接、上电和关键模块调试。</w:t>
+        <w:t>完成 12 导联心电采集板、雷达板或自制控制板卡样机的焊接、上电和关键模块调试。</w:t>
       </w:r>
     </w:p>
     <w:p>
@@ -100,17 +100,6 @@
           <w:rFonts w:ascii="Times New Roman" w:hAnsi="Times New Roman" w:eastAsia="宋体"/>
         </w:rPr>
         <w:t>完成 A5E 由 1GB 向 4GB 内存扩展的板级验证准备，支撑双网口边缘采集终端容量扩展。</w:t>
-      </w:r>
-    </w:p>
-    <w:p>
-      <w:pPr>
-        <w:pStyle w:val="ListBullet"/>
-      </w:pPr>
-      <w:r>
-        <w:rPr>
-          <w:rFonts w:ascii="Times New Roman" w:hAnsi="Times New Roman" w:eastAsia="宋体"/>
-        </w:rPr>
-        <w:t>完成无线通信模块和 MIPI 触摸显示屏的接口验证准备，支撑控制板卡通信、人机交互和样机状态显示。</w:t>
       </w:r>
     </w:p>
     <w:p>
@@ -226,7 +215,7 @@
                 <w:rFonts w:ascii="Times New Roman" w:hAnsi="Times New Roman" w:eastAsia="宋体"/>
                 <w:sz w:val="16"/>
               </w:rPr>
-              <w:t>12导联采集板元器件购物车</w:t>
+              <w:t>电子元器件</w:t>
             </w:r>
           </w:p>
         </w:tc>
@@ -260,7 +249,7 @@
                 <w:rFonts w:ascii="Times New Roman" w:hAnsi="Times New Roman" w:eastAsia="宋体"/>
                 <w:sz w:val="16"/>
               </w:rPr>
-              <w:t>792.70</w:t>
+              <w:t>987.11</w:t>
             </w:r>
           </w:p>
         </w:tc>
@@ -277,7 +266,7 @@
                 <w:rFonts w:ascii="Times New Roman" w:hAnsi="Times New Roman" w:eastAsia="宋体"/>
                 <w:sz w:val="16"/>
               </w:rPr>
-              <w:t>792.70</w:t>
+              <w:t>987.11</w:t>
             </w:r>
           </w:p>
         </w:tc>
@@ -291,7 +280,7 @@
                 <w:rFonts w:ascii="Times New Roman" w:hAnsi="Times New Roman" w:eastAsia="宋体"/>
                 <w:sz w:val="16"/>
               </w:rPr>
-              <w:t>立创商城购物车 76 项；完整明细见五、其他附件表</w:t>
+              <w:t>含立创商城购物车 76 项、LPDDR4X 内存颗粒、RTL8723DS 模块和 6.9 寸 MIPI 触摸显示屏</w:t>
             </w:r>
           </w:p>
         </w:tc>
@@ -307,7 +296,7 @@
                 <w:rFonts w:ascii="Times New Roman" w:hAnsi="Times New Roman" w:eastAsia="宋体"/>
                 <w:sz w:val="16"/>
               </w:rPr>
-              <w:t>MT53D1024M32D4DT-053WT:D 4G LPDDR4X 颗粒</w:t>
+              <w:t>合计</w:t>
             </w:r>
           </w:p>
         </w:tc>
@@ -324,7 +313,6 @@
                 <w:rFonts w:ascii="Times New Roman" w:hAnsi="Times New Roman" w:eastAsia="宋体"/>
                 <w:sz w:val="16"/>
               </w:rPr>
-              <w:t>1</w:t>
             </w:r>
           </w:p>
         </w:tc>
@@ -341,7 +329,6 @@
                 <w:rFonts w:ascii="Times New Roman" w:hAnsi="Times New Roman" w:eastAsia="宋体"/>
                 <w:sz w:val="16"/>
               </w:rPr>
-              <w:t>55.00</w:t>
             </w:r>
           </w:p>
         </w:tc>
@@ -358,7 +345,7 @@
                 <w:rFonts w:ascii="Times New Roman" w:hAnsi="Times New Roman" w:eastAsia="宋体"/>
                 <w:sz w:val="16"/>
               </w:rPr>
-              <w:t>55.00</w:t>
+              <w:t>987.11</w:t>
             </w:r>
           </w:p>
         </w:tc>
@@ -372,7 +359,107 @@
                 <w:rFonts w:ascii="Times New Roman" w:hAnsi="Times New Roman" w:eastAsia="宋体"/>
                 <w:sz w:val="16"/>
               </w:rPr>
-              <w:t>用于 A5E 升级到 4GB 的板级验证</w:t>
+              <w:t>实际以审批后订单及发票为准</w:t>
+            </w:r>
+          </w:p>
+        </w:tc>
+      </w:tr>
+    </w:tbl>
+    <w:p>
+      <w:r>
+        <w:rPr>
+          <w:rFonts w:ascii="Times New Roman" w:hAnsi="Times New Roman" w:eastAsia="宋体"/>
+          <w:b/>
+        </w:rPr>
+        <w:t>截图与明细对应表：</w:t>
+      </w:r>
+    </w:p>
+    <w:tbl>
+      <w:tblPr>
+        <w:tblStyle w:val="TableGrid"/>
+        <w:tblW w:type="auto" w:w="0"/>
+        <w:tblLook w:firstColumn="1" w:firstRow="1" w:lastColumn="0" w:lastRow="0" w:noHBand="0" w:noVBand="1" w:val="04A0"/>
+      </w:tblPr>
+      <w:tblGrid>
+        <w:gridCol w:w="1728"/>
+        <w:gridCol w:w="1728"/>
+        <w:gridCol w:w="1728"/>
+        <w:gridCol w:w="1728"/>
+        <w:gridCol w:w="1728"/>
+      </w:tblGrid>
+      <w:tr>
+        <w:tc>
+          <w:tcPr>
+            <w:tcW w:type="dxa" w:w="1728"/>
+          </w:tcPr>
+          <w:p>
+            <w:r>
+              <w:rPr>
+                <w:rFonts w:ascii="Times New Roman" w:hAnsi="Times New Roman" w:eastAsia="黑体"/>
+                <w:b/>
+                <w:sz w:val="16"/>
+              </w:rPr>
+              <w:t>截图/来源</w:t>
+            </w:r>
+          </w:p>
+        </w:tc>
+        <w:tc>
+          <w:tcPr>
+            <w:tcW w:type="dxa" w:w="1728"/>
+          </w:tcPr>
+          <w:p>
+            <w:r>
+              <w:rPr>
+                <w:rFonts w:ascii="Times New Roman" w:hAnsi="Times New Roman" w:eastAsia="黑体"/>
+                <w:b/>
+                <w:sz w:val="16"/>
+              </w:rPr>
+              <w:t>对应物料</w:t>
+            </w:r>
+          </w:p>
+        </w:tc>
+        <w:tc>
+          <w:tcPr>
+            <w:tcW w:type="dxa" w:w="1728"/>
+          </w:tcPr>
+          <w:p>
+            <w:r>
+              <w:rPr>
+                <w:rFonts w:ascii="Times New Roman" w:hAnsi="Times New Roman" w:eastAsia="黑体"/>
+                <w:b/>
+                <w:sz w:val="16"/>
+              </w:rPr>
+              <w:t>数量</w:t>
+            </w:r>
+          </w:p>
+        </w:tc>
+        <w:tc>
+          <w:tcPr>
+            <w:tcW w:type="dxa" w:w="1728"/>
+          </w:tcPr>
+          <w:p>
+            <w:r>
+              <w:rPr>
+                <w:rFonts w:ascii="Times New Roman" w:hAnsi="Times New Roman" w:eastAsia="黑体"/>
+                <w:b/>
+                <w:sz w:val="16"/>
+              </w:rPr>
+              <w:t>小计(CNY)</w:t>
+            </w:r>
+          </w:p>
+        </w:tc>
+        <w:tc>
+          <w:tcPr>
+            <w:tcW w:type="dxa" w:w="1728"/>
+          </w:tcPr>
+          <w:p>
+            <w:r>
+              <w:rPr>
+                <w:rFonts w:ascii="Times New Roman" w:hAnsi="Times New Roman" w:eastAsia="黑体"/>
+                <w:b/>
+                <w:sz w:val="16"/>
+              </w:rPr>
+              <w:t>说明</w:t>
             </w:r>
           </w:p>
         </w:tc>
@@ -388,7 +475,7 @@
                 <w:rFonts w:ascii="Times New Roman" w:hAnsi="Times New Roman" w:eastAsia="宋体"/>
                 <w:sz w:val="16"/>
               </w:rPr>
-              <w:t>RTL8723DS WiFi/BT 模块</w:t>
+              <w:t>LPDDR4X 内存颗粒截图</w:t>
             </w:r>
           </w:p>
         </w:tc>
@@ -405,6 +492,23 @@
                 <w:rFonts w:ascii="Times New Roman" w:hAnsi="Times New Roman" w:eastAsia="宋体"/>
                 <w:sz w:val="16"/>
               </w:rPr>
+              <w:t>MT53D1024M32D4DT-053WT:D 4G LPDDR4X 颗粒</w:t>
+            </w:r>
+          </w:p>
+        </w:tc>
+        <w:tc>
+          <w:tcPr>
+            <w:tcW w:type="dxa" w:w="1728"/>
+          </w:tcPr>
+          <w:p>
+            <w:pPr>
+              <w:jc w:val="center"/>
+            </w:pPr>
+            <w:r>
+              <w:rPr>
+                <w:rFonts w:ascii="Times New Roman" w:hAnsi="Times New Roman" w:eastAsia="宋体"/>
+                <w:sz w:val="16"/>
+              </w:rPr>
               <w:t>1</w:t>
             </w:r>
           </w:p>
@@ -422,7 +526,7 @@
                 <w:rFonts w:ascii="Times New Roman" w:hAnsi="Times New Roman" w:eastAsia="宋体"/>
                 <w:sz w:val="16"/>
               </w:rPr>
-              <w:t>7.91</w:t>
+              <w:t>55.00</w:t>
             </w:r>
           </w:p>
         </w:tc>
@@ -431,29 +535,12 @@
             <w:tcW w:type="dxa" w:w="1728"/>
           </w:tcPr>
           <w:p>
-            <w:pPr>
-              <w:jc w:val="center"/>
-            </w:pPr>
             <w:r>
               <w:rPr>
                 <w:rFonts w:ascii="Times New Roman" w:hAnsi="Times New Roman" w:eastAsia="宋体"/>
                 <w:sz w:val="16"/>
               </w:rPr>
-              <w:t>7.91</w:t>
-            </w:r>
-          </w:p>
-        </w:tc>
-        <w:tc>
-          <w:tcPr>
-            <w:tcW w:type="dxa" w:w="1728"/>
-          </w:tcPr>
-          <w:p>
-            <w:r>
-              <w:rPr>
-                <w:rFonts w:ascii="Times New Roman" w:hAnsi="Times New Roman" w:eastAsia="宋体"/>
-                <w:sz w:val="16"/>
-              </w:rPr>
-              <w:t>用于自制控制板卡和小型采集节点通信接口</w:t>
+              <w:t>用于 A5E 升级到 4GB 的板级验证</w:t>
             </w:r>
           </w:p>
         </w:tc>
@@ -469,7 +556,7 @@
                 <w:rFonts w:ascii="Times New Roman" w:hAnsi="Times New Roman" w:eastAsia="宋体"/>
                 <w:sz w:val="16"/>
               </w:rPr>
-              <w:t>6.9 寸 280x1424 MIPI 触摸显示屏</w:t>
+              <w:t>RTL8723DS 模块截图</w:t>
             </w:r>
           </w:p>
         </w:tc>
@@ -486,6 +573,23 @@
                 <w:rFonts w:ascii="Times New Roman" w:hAnsi="Times New Roman" w:eastAsia="宋体"/>
                 <w:sz w:val="16"/>
               </w:rPr>
+              <w:t>RTL8723DS WiFi/BT 模块</w:t>
+            </w:r>
+          </w:p>
+        </w:tc>
+        <w:tc>
+          <w:tcPr>
+            <w:tcW w:type="dxa" w:w="1728"/>
+          </w:tcPr>
+          <w:p>
+            <w:pPr>
+              <w:jc w:val="center"/>
+            </w:pPr>
+            <w:r>
+              <w:rPr>
+                <w:rFonts w:ascii="Times New Roman" w:hAnsi="Times New Roman" w:eastAsia="宋体"/>
+                <w:sz w:val="16"/>
+              </w:rPr>
               <w:t>1</w:t>
             </w:r>
           </w:p>
@@ -503,7 +607,7 @@
                 <w:rFonts w:ascii="Times New Roman" w:hAnsi="Times New Roman" w:eastAsia="宋体"/>
                 <w:sz w:val="16"/>
               </w:rPr>
-              <w:t>131.50</w:t>
+              <w:t>7.91</w:t>
             </w:r>
           </w:p>
         </w:tc>
@@ -512,29 +616,12 @@
             <w:tcW w:type="dxa" w:w="1728"/>
           </w:tcPr>
           <w:p>
-            <w:pPr>
-              <w:jc w:val="center"/>
-            </w:pPr>
             <w:r>
               <w:rPr>
                 <w:rFonts w:ascii="Times New Roman" w:hAnsi="Times New Roman" w:eastAsia="宋体"/>
                 <w:sz w:val="16"/>
               </w:rPr>
-              <w:t>131.50</w:t>
-            </w:r>
-          </w:p>
-        </w:tc>
-        <w:tc>
-          <w:tcPr>
-            <w:tcW w:type="dxa" w:w="1728"/>
-          </w:tcPr>
-          <w:p>
-            <w:r>
-              <w:rPr>
-                <w:rFonts w:ascii="Times New Roman" w:hAnsi="Times New Roman" w:eastAsia="宋体"/>
-                <w:sz w:val="16"/>
-              </w:rPr>
-              <w:t>用于便携式控制面板、雷达板调试界面和样机状态显示</w:t>
+              <w:t>用于自制控制板卡和小型采集节点通信接口</w:t>
             </w:r>
           </w:p>
         </w:tc>
@@ -550,7 +637,7 @@
                 <w:rFonts w:ascii="Times New Roman" w:hAnsi="Times New Roman" w:eastAsia="宋体"/>
                 <w:sz w:val="16"/>
               </w:rPr>
-              <w:t>合计</w:t>
+              <w:t>MIPI 触摸显示屏截图</w:t>
             </w:r>
           </w:p>
         </w:tc>
@@ -567,6 +654,7 @@
                 <w:rFonts w:ascii="Times New Roman" w:hAnsi="Times New Roman" w:eastAsia="宋体"/>
                 <w:sz w:val="16"/>
               </w:rPr>
+              <w:t>6.9 寸 280x1424 MIPI 触摸显示屏</w:t>
             </w:r>
           </w:p>
         </w:tc>
@@ -583,6 +671,7 @@
                 <w:rFonts w:ascii="Times New Roman" w:hAnsi="Times New Roman" w:eastAsia="宋体"/>
                 <w:sz w:val="16"/>
               </w:rPr>
+              <w:t>1</w:t>
             </w:r>
           </w:p>
         </w:tc>
@@ -599,7 +688,7 @@
                 <w:rFonts w:ascii="Times New Roman" w:hAnsi="Times New Roman" w:eastAsia="宋体"/>
                 <w:sz w:val="16"/>
               </w:rPr>
-              <w:t>987.11</w:t>
+              <w:t>131.50</w:t>
             </w:r>
           </w:p>
         </w:tc>
@@ -613,7 +702,88 @@
                 <w:rFonts w:ascii="Times New Roman" w:hAnsi="Times New Roman" w:eastAsia="宋体"/>
                 <w:sz w:val="16"/>
               </w:rPr>
-              <w:t>实际以审批后订单及发票为准</w:t>
+              <w:t>用于便携式控制面板、雷达板调试界面和样机状态显示</w:t>
+            </w:r>
+          </w:p>
+        </w:tc>
+      </w:tr>
+      <w:tr>
+        <w:tc>
+          <w:tcPr>
+            <w:tcW w:type="dxa" w:w="1728"/>
+          </w:tcPr>
+          <w:p>
+            <w:r>
+              <w:rPr>
+                <w:rFonts w:ascii="Times New Roman" w:hAnsi="Times New Roman" w:eastAsia="宋体"/>
+                <w:sz w:val="16"/>
+              </w:rPr>
+              <w:t>立创商城购物车截图</w:t>
+            </w:r>
+          </w:p>
+        </w:tc>
+        <w:tc>
+          <w:tcPr>
+            <w:tcW w:type="dxa" w:w="1728"/>
+          </w:tcPr>
+          <w:p>
+            <w:pPr>
+              <w:jc w:val="center"/>
+            </w:pPr>
+            <w:r>
+              <w:rPr>
+                <w:rFonts w:ascii="Times New Roman" w:hAnsi="Times New Roman" w:eastAsia="宋体"/>
+                <w:sz w:val="16"/>
+              </w:rPr>
+              <w:t>立创商城购物车 76 项</w:t>
+            </w:r>
+          </w:p>
+        </w:tc>
+        <w:tc>
+          <w:tcPr>
+            <w:tcW w:type="dxa" w:w="1728"/>
+          </w:tcPr>
+          <w:p>
+            <w:pPr>
+              <w:jc w:val="center"/>
+            </w:pPr>
+            <w:r>
+              <w:rPr>
+                <w:rFonts w:ascii="Times New Roman" w:hAnsi="Times New Roman" w:eastAsia="宋体"/>
+                <w:sz w:val="16"/>
+              </w:rPr>
+              <w:t>1批</w:t>
+            </w:r>
+          </w:p>
+        </w:tc>
+        <w:tc>
+          <w:tcPr>
+            <w:tcW w:type="dxa" w:w="1728"/>
+          </w:tcPr>
+          <w:p>
+            <w:pPr>
+              <w:jc w:val="center"/>
+            </w:pPr>
+            <w:r>
+              <w:rPr>
+                <w:rFonts w:ascii="Times New Roman" w:hAnsi="Times New Roman" w:eastAsia="宋体"/>
+                <w:sz w:val="16"/>
+              </w:rPr>
+              <w:t>792.70</w:t>
+            </w:r>
+          </w:p>
+        </w:tc>
+        <w:tc>
+          <w:tcPr>
+            <w:tcW w:type="dxa" w:w="1728"/>
+          </w:tcPr>
+          <w:p>
+            <w:r>
+              <w:rPr>
+                <w:rFonts w:ascii="Times New Roman" w:hAnsi="Times New Roman" w:eastAsia="宋体"/>
+                <w:sz w:val="16"/>
+              </w:rPr>
+              <w:t>预留截图位置；当前以下载 xls 和仓库归档明细为准</w:t>
             </w:r>
           </w:p>
         </w:tc>
@@ -711,51 +881,6 @@
           <w:rFonts w:ascii="Times New Roman" w:hAnsi="Times New Roman" w:eastAsia="宋体"/>
           <w:b w:val="0"/>
         </w:rPr>
-        <w:t>立创购物车价格凭证</w:t>
-      </w:r>
-    </w:p>
-    <w:p>
-      <w:r>
-        <w:drawing>
-          <wp:inline xmlns:a="http://schemas.openxmlformats.org/drawingml/2006/main" xmlns:pic="http://schemas.openxmlformats.org/drawingml/2006/picture">
-            <wp:extent cx="5166360" cy="3164395"/>
-            <wp:docPr id="1" name="Picture 1"/>
-            <wp:cNvGraphicFramePr>
-              <a:graphicFrameLocks noChangeAspect="1"/>
-            </wp:cNvGraphicFramePr>
-            <a:graphic>
-              <a:graphicData uri="http://schemas.openxmlformats.org/drawingml/2006/picture">
-                <pic:pic>
-                  <pic:nvPicPr>
-                    <pic:cNvPr id="0" name="lcsc-cart-summary.png"/>
-                    <pic:cNvPicPr/>
-                  </pic:nvPicPr>
-                  <pic:blipFill>
-                    <a:blip r:embed="rId9"/>
-                    <a:stretch>
-                      <a:fillRect/>
-                    </a:stretch>
-                  </pic:blipFill>
-                  <pic:spPr>
-                    <a:xfrm>
-                      <a:off x="0" y="0"/>
-                      <a:ext cx="5166360" cy="3164395"/>
-                    </a:xfrm>
-                    <a:prstGeom prst="rect"/>
-                  </pic:spPr>
-                </pic:pic>
-              </a:graphicData>
-            </a:graphic>
-          </wp:inline>
-        </w:drawing>
-      </w:r>
-    </w:p>
-    <w:p>
-      <w:r>
-        <w:rPr>
-          <w:rFonts w:ascii="Times New Roman" w:hAnsi="Times New Roman" w:eastAsia="宋体"/>
-          <w:b w:val="0"/>
-        </w:rPr>
         <w:t>LPDDR4X 内存颗粒价格截图</w:t>
       </w:r>
     </w:p>
@@ -764,7 +889,7 @@
         <w:drawing>
           <wp:inline xmlns:a="http://schemas.openxmlformats.org/drawingml/2006/main" xmlns:pic="http://schemas.openxmlformats.org/drawingml/2006/picture">
             <wp:extent cx="5166360" cy="2809208"/>
-            <wp:docPr id="2" name="Picture 2"/>
+            <wp:docPr id="1" name="Picture 1"/>
             <wp:cNvGraphicFramePr>
               <a:graphicFrameLocks noChangeAspect="1"/>
             </wp:cNvGraphicFramePr>
@@ -776,7 +901,7 @@
                     <pic:cNvPicPr/>
                   </pic:nvPicPr>
                   <pic:blipFill>
-                    <a:blip r:embed="rId10"/>
+                    <a:blip r:embed="rId9"/>
                     <a:stretch>
                       <a:fillRect/>
                     </a:stretch>
@@ -809,7 +934,7 @@
         <w:drawing>
           <wp:inline xmlns:a="http://schemas.openxmlformats.org/drawingml/2006/main" xmlns:pic="http://schemas.openxmlformats.org/drawingml/2006/picture">
             <wp:extent cx="5166360" cy="2647962"/>
-            <wp:docPr id="3" name="Picture 3"/>
+            <wp:docPr id="2" name="Picture 2"/>
             <wp:cNvGraphicFramePr>
               <a:graphicFrameLocks noChangeAspect="1"/>
             </wp:cNvGraphicFramePr>
@@ -821,7 +946,7 @@
                     <pic:cNvPicPr/>
                   </pic:nvPicPr>
                   <pic:blipFill>
-                    <a:blip r:embed="rId11"/>
+                    <a:blip r:embed="rId10"/>
                     <a:stretch>
                       <a:fillRect/>
                     </a:stretch>
@@ -854,7 +979,7 @@
         <w:drawing>
           <wp:inline xmlns:a="http://schemas.openxmlformats.org/drawingml/2006/main" xmlns:pic="http://schemas.openxmlformats.org/drawingml/2006/picture">
             <wp:extent cx="5166360" cy="2647962"/>
-            <wp:docPr id="4" name="Picture 4"/>
+            <wp:docPr id="3" name="Picture 3"/>
             <wp:cNvGraphicFramePr>
               <a:graphicFrameLocks noChangeAspect="1"/>
             </wp:cNvGraphicFramePr>
@@ -866,7 +991,7 @@
                     <pic:cNvPicPr/>
                   </pic:nvPicPr>
                   <pic:blipFill>
-                    <a:blip r:embed="rId12"/>
+                    <a:blip r:embed="rId11"/>
                     <a:stretch>
                       <a:fillRect/>
                     </a:stretch>
@@ -12518,7 +12643,7 @@
                 <w:rFonts w:ascii="Times New Roman" w:hAnsi="Times New Roman" w:eastAsia="宋体"/>
                 <w:sz w:val="16"/>
               </w:rPr>
-              <w:t>完整明细见上表</w:t>
+              <w:t>完整明细见上表，购物车截图位置已在经费数量中预留</w:t>
             </w:r>
           </w:p>
         </w:tc>

</xml_diff>

<commit_message>
Strengthen Raspberry Pi SSD proposal
</commit_message>
<xml_diff>
--- a/applications/2026/Q2/实验室电子元器件采集/申报书.docx
+++ b/applications/2026/Q2/实验室电子元器件采集/申报书.docx
@@ -832,17 +832,6 @@
           <w:rFonts w:ascii="Times New Roman" w:hAnsi="Times New Roman" w:eastAsia="宋体"/>
         </w:rPr>
         <w:t>支撑 A5E 4GB 内存升级验证，为双网口边缘采集终端提供更高内存余量和系统扩展能力。</w:t>
-      </w:r>
-    </w:p>
-    <w:p>
-      <w:pPr>
-        <w:pStyle w:val="ListBullet"/>
-      </w:pPr>
-      <w:r>
-        <w:rPr>
-          <w:rFonts w:ascii="Times New Roman" w:hAnsi="Times New Roman" w:eastAsia="宋体"/>
-        </w:rPr>
-        <w:t>补齐无线通信和触摸显示类器件，支撑控制板卡、便携式实验终端和雷达板调试界面建设。</w:t>
       </w:r>
     </w:p>
     <w:p>

</xml_diff>